<commit_message>
Validate novelty claims from raw data; correct report and UI text
- validation/validate_novelty.py + results/novelty_validation.txt: recompute all six
  novelty claims (SilentBench/HBW-MTTC, probe design, compound faults, cost-coverage,
  quality-aware recovery, deadline-aware degradation) from results/: 34/34 match.
- Report v3: validation table 19 -> 21 checks, Grafana 15 -> 16 panels; "to the best of
  our knowledge" wording; layers complementary only for per-request checking; exact
  binomial bounds for all-zero cells; config A / image-tag comparability note; operator
  image-tag confound; golden-check limitation in the abstract.
- Home page: correct CES formula (0.6/0.4, humidity excluded), 1.051/1.300 thresholds,
  real algorithms; result page: no blank humidity Z.
- RESTORE.md: add Flask/Werkzeug to the pip list.

Co-Authored-By: Claude Sonnet 5.5 <noreply@anthropic.com>
</commit_message>
<xml_diff>
--- a/Project_Report_Silent_Failures_Kubernetes_v3.docx
+++ b/Project_Report_Silent_Failures_Kubernetes_v3.docx
@@ -7369,7 +7369,7 @@
                 <w:sz w:val="24"/>
                 <w:szCs w:val="24"/>
               </w:rPr>
-              <w:t>Table 5.2   Executed validation checks (19 of 19 passed)</w:t>
+              <w:t>Table 5.2   Executed validation checks (21 of 21 passed)</w:t>
             </w:r>
           </w:p>
         </w:tc>
@@ -16010,7 +16010,7 @@
               <w:rPr>
                 <w:sz w:val="19"/>
               </w:rPr>
-              <w:t>Metrics, dashboards and traces shall be available in Prometheus, Grafana (15 panels) and Jaeger.</w:t>
+              <w:t>Metrics, dashboards and traces shall be available in Prometheus, Grafana (16 panels) and Jaeger.</w:t>
             </w:r>
           </w:p>
         </w:tc>
@@ -21508,7 +21508,7 @@
           <w:sz w:val="24"/>
           <w:szCs w:val="24"/>
         </w:rPr>
-        <w:t>Supporting tools: Python libraries (Flask, gunicorn, TensorFlow, statsmodels, scikit-learn, scipy, kopf, requests, matplotlib), Helm charts (Prometheus, Grafana, Kyverno, KEDA, Chaos Mesh), Argo Rollouts, cosign, Git and Git LFS, and a validation suite (validation/validate_all.py) with nineteen executed checks.</w:t>
+        <w:t>Supporting tools: Python libraries (Flask, gunicorn, TensorFlow, statsmodels, scikit-learn, scipy, kopf, requests, matplotlib), Helm charts (Prometheus, Grafana, Kyverno, KEDA, Chaos Mesh), Argo Rollouts, cosign, Git and Git LFS, and a validation suite (validation/validate_all.py) with twenty-one executed checks.</w:t>
       </w:r>
     </w:p>
     <w:p>
@@ -26276,7 +26276,7 @@
           <w:color w:val="000000"/>
           <w:szCs w:val="24"/>
         </w:rPr>
-        <w:t>Table 5.2  Executed validation checks (19 of 19 passed)</w:t>
+        <w:t>Table 5.2  Executed validation checks (21 of 21 passed)</w:t>
       </w:r>
     </w:p>
     <w:p>
@@ -26987,7 +26987,7 @@
           <w:sz w:val="24"/>
           <w:szCs w:val="24"/>
         </w:rPr>
-        <w:t>The implementation consists of a guarded inference service, a Flask frontend, a kopf operator and a large set of experiment and analysis scripts. Testing combined unit tests, a nineteen-check validation suite, data-integrity checks and a browser walk-through, and it uncovered eleven defects that were fixed from their root causes.</w:t>
+        <w:t>The implementation consists of a guarded inference service, a Flask frontend, a kopf operator and a large set of experiment and analysis scripts. Testing combined unit tests, a twenty-one-check validation suite, data-integrity checks and a browser walk-through, and it uncovered eleven defects that were fixed from their root causes.</w:t>
       </w:r>
     </w:p>
     <w:p>
@@ -27098,7 +27098,7 @@
           <w:sz w:val="24"/>
           <w:szCs w:val="24"/>
         </w:rPr>
-        <w:t>d Ready while every answer is wrong.</w:t>
+        <w:t>d Ready while every answer is wrong. Configuration A runs two gunicorn workers while B, C and D run one, so its hang and oom rows are not like-for-like; Tables 6.1 to 6.6 were measured on different image tags and server settings (inference images :2 to :12, synchronous and threaded workers) and are therefore compared within a table, not across tables.</w:t>
       </w:r>
     </w:p>
     <w:tbl>
@@ -28788,7 +28788,7 @@
           <w:sz w:val="24"/>
           <w:szCs w:val="24"/>
         </w:rPr>
-        <w:t>ck. The delay fault does not produce wrong answers but failed requests; it is handled in Section 6.5.</w:t>
+        <w:t>ck. The delay fault does not produce wrong answers but failed requests; it is handled in Section 6.5. Because a bootstrap interval of an all-zero sample is degenerate ([0.0, 0.0]), the exact one-sided 95 percent upper bound for zero wrong answers is 25.9 percent for 10 trials, 28.3 percent for 9 trials and 45.1 percent for 5 trials; the G4 cells with n = 5 are therefore weaker evidence than the n = 10 cells. All faults were designed by the authors, and the eight-flip bit fault was chosen to stay inside the envelope.</w:t>
       </w:r>
     </w:p>
     <w:tbl>
@@ -30564,7 +30564,7 @@
           <w:szCs w:val="24"/>
         </w:rPr>
         <w:lastRenderedPageBreak/>
-        <w:t>both policies choose the same action, so it is run-to-run drift and not a policy effect. The rules policy versus no ope</w:t>
+        <w:t>both policies choose the same action, so it is run-to-run drift and not a policy effect; the rules trials ran on image :6 and the bandit trials on image :5, which is a further confound for this comparison. The rules policy versus no ope</w:t>
       </w:r>
       <w:r>
         <w:rPr>
@@ -34246,7 +34246,7 @@
               <w:rPr>
                 <w:sz w:val="19"/>
               </w:rPr>
-              <w:t>First measured comparison of monolith, Compose and Kubernetes under faults that keep the service healthy but wrong</w:t>
+              <w:t>To the best of our knowledge, the first measured comparison of monolith, Compose and Kubernetes under faults that keep the service healthy but wrong</w:t>
             </w:r>
           </w:p>
         </w:tc>
@@ -43022,7 +43022,7 @@
           <w:color w:val="000000"/>
           <w:szCs w:val="24"/>
         </w:rPr>
-        <w:t>r restored full quality in 20 of 20 trials in about 22-24 s against never without it; and deadline-aware degradation reduced failed requests under a delay fault from 96.8 percent to 0 percent. We also report negative results (probe tuning, learned policy, log-based detection, scaling) and the limits of the study.</w:t>
+        <w:t>r restored full quality in 20 of 20 trials in about 22-24 s against never without it; and deadline-aware degradation reduced failed requests under a delay fault from 96.8 percent to 0 percent. We also report negative results (probe tuning, learned policy, log-based detection, scaling) and the limits of the study, including that the golden-output check detects change from a trusted start-up state only.</w:t>
       </w:r>
     </w:p>
     <w:p>
@@ -43389,7 +43389,7 @@
           <w:color w:val="000000"/>
           <w:szCs w:val="24"/>
         </w:rPr>
-        <w:t>The layers are complementary: each closed a class of faults left by the previous layers. The golden check relies on determinism and a trusted start-up state. Probe tuning was secondary to replicas; the learned policy equalled rules in a two-action space; log-based detection had no signal; scaling results on one node were inconclusive and an earlier negative claim was withdrawn after a thread-pool artefact was found. Sample sizes are small and faults are synthetic.</w:t>
+        <w:t>For per-request checking the layers are complementary: each closed a class of faults left by the previous layers (the golden check alone detects every injected fault but costs about 182 ms per check, Section 6.7). The golden check relies on determinism and a trusted start-up state. Probe tuning was secondary to replicas; the learned policy equalled rules in a two-action space; log-based detection had no signal; scaling results on one node were inconclusive and an earlier negative claim was withdrawn after a thread-pool artefact was found. Sample sizes are small and faults are synthetic.</w:t>
       </w:r>
     </w:p>
     <w:p>

</xml_diff>